<commit_message>
docs(plan): reassign team roles in the 03 project plan
Преслав now leads the team alongside QA, and Радостин owns UI/UX
alongside the front-end. Кристиян keeps the back-end. Same change in
ProjectPlan.md and ProjectPlan.docx.
</commit_message>
<xml_diff>
--- a/docs/ProjectPlan.docx
+++ b/docs/ProjectPlan.docx
@@ -2628,7 +2628,7 @@
         <w:pStyle w:val="FirstParagraph"/>
       </w:pPr>
       <w:r>
-        <w:t xml:space="preserve">Екипът е от трима души; Кристиян заема няколко роли.</w:t>
+        <w:t xml:space="preserve">Екипът е от трима души; Радостин и Преслав заемат по две роли.</w:t>
       </w:r>
     </w:p>
     <w:tbl>
@@ -2730,6 +2730,50 @@
               <w:jc w:val="left"/>
             </w:pPr>
             <w:r>
+              <w:t xml:space="preserve">Преслав</w:t>
+            </w:r>
+          </w:p>
+        </w:tc>
+      </w:tr>
+      <w:tr>
+        <w:tc>
+          <w:tcPr>
+            <w:tcW w:type="dxa" w:w="2819"/>
+          </w:tcPr>
+          <w:p>
+            <w:pPr>
+              <w:pStyle w:val="Compact"/>
+              <w:jc w:val="left"/>
+            </w:pPr>
+            <w:r>
+              <w:t xml:space="preserve">Back-end</w:t>
+            </w:r>
+          </w:p>
+        </w:tc>
+        <w:tc>
+          <w:tcPr>
+            <w:tcW w:type="dxa" w:w="4311"/>
+          </w:tcPr>
+          <w:p>
+            <w:pPr>
+              <w:pStyle w:val="Compact"/>
+              <w:jc w:val="left"/>
+            </w:pPr>
+            <w:r>
+              <w:t xml:space="preserve">база данни и миграции, хранилище (repository), услуги и бизнес правила, REST API</w:t>
+            </w:r>
+          </w:p>
+        </w:tc>
+        <w:tc>
+          <w:tcPr>
+            <w:tcW w:type="dxa" w:w="2508"/>
+          </w:tcPr>
+          <w:p>
+            <w:pPr>
+              <w:pStyle w:val="Compact"/>
+              <w:jc w:val="left"/>
+            </w:pPr>
+            <w:r>
               <w:t xml:space="preserve">Кристиян</w:t>
             </w:r>
           </w:p>
@@ -2746,7 +2790,7 @@
               <w:jc w:val="left"/>
             </w:pPr>
             <w:r>
-              <w:t xml:space="preserve">Back-end</w:t>
+              <w:t xml:space="preserve">Front-end</w:t>
             </w:r>
           </w:p>
         </w:tc>
@@ -2760,7 +2804,7 @@
               <w:jc w:val="left"/>
             </w:pPr>
             <w:r>
-              <w:t xml:space="preserve">база данни и миграции, хранилище (repository), услуги и бизнес правила, REST API</w:t>
+              <w:t xml:space="preserve">Razor изгледи, админ панел, схема на местата (JavaScript, AJAX)</w:t>
             </w:r>
           </w:p>
         </w:tc>
@@ -2774,7 +2818,7 @@
               <w:jc w:val="left"/>
             </w:pPr>
             <w:r>
-              <w:t xml:space="preserve">Кристиян</w:t>
+              <w:t xml:space="preserve">Радостин</w:t>
             </w:r>
           </w:p>
         </w:tc>
@@ -2790,7 +2834,7 @@
               <w:jc w:val="left"/>
             </w:pPr>
             <w:r>
-              <w:t xml:space="preserve">Front-end</w:t>
+              <w:t xml:space="preserve">UI/UX</w:t>
             </w:r>
           </w:p>
         </w:tc>
@@ -2804,7 +2848,7 @@
               <w:jc w:val="left"/>
             </w:pPr>
             <w:r>
-              <w:t xml:space="preserve">Razor изгледи, админ панел, схема на местата (JavaScript, AJAX)</w:t>
+              <w:t xml:space="preserve">оформление (Bootstrap 5), навигация, адаптивен дизайн, достъпност, текстове</w:t>
             </w:r>
           </w:p>
         </w:tc>
@@ -2819,50 +2863,6 @@
             </w:pPr>
             <w:r>
               <w:t xml:space="preserve">Радостин</w:t>
-            </w:r>
-          </w:p>
-        </w:tc>
-      </w:tr>
-      <w:tr>
-        <w:tc>
-          <w:tcPr>
-            <w:tcW w:type="dxa" w:w="2819"/>
-          </w:tcPr>
-          <w:p>
-            <w:pPr>
-              <w:pStyle w:val="Compact"/>
-              <w:jc w:val="left"/>
-            </w:pPr>
-            <w:r>
-              <w:t xml:space="preserve">UI/UX</w:t>
-            </w:r>
-          </w:p>
-        </w:tc>
-        <w:tc>
-          <w:tcPr>
-            <w:tcW w:type="dxa" w:w="4311"/>
-          </w:tcPr>
-          <w:p>
-            <w:pPr>
-              <w:pStyle w:val="Compact"/>
-              <w:jc w:val="left"/>
-            </w:pPr>
-            <w:r>
-              <w:t xml:space="preserve">оформление (Bootstrap 5), навигация, адаптивен дизайн, достъпност, текстове</w:t>
-            </w:r>
-          </w:p>
-        </w:tc>
-        <w:tc>
-          <w:tcPr>
-            <w:tcW w:type="dxa" w:w="2508"/>
-          </w:tcPr>
-          <w:p>
-            <w:pPr>
-              <w:pStyle w:val="Compact"/>
-              <w:jc w:val="left"/>
-            </w:pPr>
-            <w:r>
-              <w:t xml:space="preserve">Кристиян</w:t>
             </w:r>
           </w:p>
         </w:tc>

</xml_diff>